<commit_message>
Commit for Day 3. Transform and Aggregate the Data.
</commit_message>
<xml_diff>
--- a/Data Analysis Project/Report.docx
+++ b/Data Analysis Project/Report.docx
@@ -4,13 +4,7 @@
   <w:body>
     <w:p>
       <w:r>
-        <w:t>Day 1 Report</w:t>
-      </w:r>
-      <w:r>
-        <w:t>:</w:t>
-      </w:r>
-      <w:r>
-        <w:t xml:space="preserve"> Environment Setup and Dataset Familiarization</w:t>
+        <w:t>Day 1 Report: Environment Setup and Dataset Familiarization</w:t>
       </w:r>
     </w:p>
     <w:p/>
@@ -21,13 +15,7 @@
     </w:p>
     <w:p>
       <w:r>
-        <w:t xml:space="preserve">The purpose of Day 1 was to set up the project environment and gain an understanding of the dataset that will be used throughout the project. This step ensures all tools, directories, and files are organized before beginning data </w:t>
-      </w:r>
-      <w:r>
-        <w:t xml:space="preserve">cleaning, </w:t>
-      </w:r>
-      <w:r>
-        <w:t>processing and analysis.</w:t>
+        <w:t>The purpose of Day 1 was to set up the project environment and gain an understanding of the dataset that will be used throughout the project. This step ensures all tools, directories, and files are organized before beginning data cleaning, processing and analysis.</w:t>
       </w:r>
     </w:p>
     <w:p/>
@@ -101,7 +89,15 @@
     </w:p>
     <w:p>
       <w:r>
-        <w:t>Linux commands such as mkdir, cd, and file management commands were used to create and navigate the directory structure.</w:t>
+        <w:t xml:space="preserve">Linux commands such as </w:t>
+      </w:r>
+      <w:proofErr w:type="spellStart"/>
+      <w:r>
+        <w:t>mkdir</w:t>
+      </w:r>
+      <w:proofErr w:type="spellEnd"/>
+      <w:r>
+        <w:t>, cd, and file management commands were used to create and navigate the directory structure.</w:t>
       </w:r>
     </w:p>
     <w:p/>
@@ -121,8 +117,13 @@
       </w:r>
     </w:p>
     <w:p>
-      <w:r>
-        <w:t xml:space="preserve">transaction_id: Unique identifier for each transaction </w:t>
+      <w:proofErr w:type="spellStart"/>
+      <w:r>
+        <w:t>transaction_id</w:t>
+      </w:r>
+      <w:proofErr w:type="spellEnd"/>
+      <w:r>
+        <w:t xml:space="preserve">: Unique identifier for each transaction </w:t>
       </w:r>
     </w:p>
     <w:p>
@@ -191,19 +192,7 @@
         </w:numPr>
       </w:pPr>
       <w:r>
-        <w:t xml:space="preserve">There </w:t>
-      </w:r>
-      <w:r>
-        <w:t>are</w:t>
-      </w:r>
-      <w:r>
-        <w:t xml:space="preserve"> missing values </w:t>
-      </w:r>
-      <w:r>
-        <w:t xml:space="preserve">and </w:t>
-      </w:r>
-      <w:r>
-        <w:t xml:space="preserve">duplicate records that need cleaning </w:t>
+        <w:t xml:space="preserve">There are missing values and duplicate records that need cleaning </w:t>
       </w:r>
     </w:p>
     <w:p>
@@ -262,6 +251,613 @@
       </w:r>
     </w:p>
     <w:p/>
+    <w:p/>
+    <w:p/>
+    <w:p/>
+    <w:p/>
+    <w:p/>
+    <w:p/>
+    <w:p/>
+    <w:p/>
+    <w:p/>
+    <w:p/>
+    <w:p/>
+    <w:p/>
+    <w:p/>
+    <w:p/>
+    <w:p>
+      <w:r>
+        <w:lastRenderedPageBreak/>
+        <w:t>Day 2 Report: Data Cleaning and Preparation</w:t>
+      </w:r>
+    </w:p>
+    <w:p>
+      <w:r>
+        <w:t>1. Introduction</w:t>
+      </w:r>
+    </w:p>
+    <w:p>
+      <w:r>
+        <w:t>The purpose of Day 2 was to clean and prepare the raw sales dataset to ensure it is accurate, consistent, and ready for further processing and analysis. This step is important as it improves data quality and prevents errors in later stages of the project.</w:t>
+      </w:r>
+    </w:p>
+    <w:p/>
+    <w:p>
+      <w:r>
+        <w:t>2. Data Ingestion</w:t>
+      </w:r>
+    </w:p>
+    <w:p>
+      <w:r>
+        <w:t xml:space="preserve">The dataset was loaded from the data directory using Python and the </w:t>
+      </w:r>
+      <w:proofErr w:type="gramStart"/>
+      <w:r>
+        <w:t>pandas</w:t>
+      </w:r>
+      <w:proofErr w:type="gramEnd"/>
+      <w:r>
+        <w:t xml:space="preserve"> library. This allowed the data to be structured into a </w:t>
+      </w:r>
+      <w:proofErr w:type="spellStart"/>
+      <w:r>
+        <w:t>DataFrame</w:t>
+      </w:r>
+      <w:proofErr w:type="spellEnd"/>
+      <w:r>
+        <w:t xml:space="preserve"> for easier manipulation and analysis.</w:t>
+      </w:r>
+    </w:p>
+    <w:p>
+      <w:r>
+        <w:t>Initial checks were performed to better understand the dataset, including:</w:t>
+      </w:r>
+    </w:p>
+    <w:p>
+      <w:pPr>
+        <w:numPr>
+          <w:ilvl w:val="0"/>
+          <w:numId w:val="5"/>
+        </w:numPr>
+      </w:pPr>
+      <w:r>
+        <w:t>Viewing the first few rows of data</w:t>
+      </w:r>
+    </w:p>
+    <w:p>
+      <w:pPr>
+        <w:numPr>
+          <w:ilvl w:val="0"/>
+          <w:numId w:val="5"/>
+        </w:numPr>
+      </w:pPr>
+      <w:r>
+        <w:t>Checking the size and structure of the dataset</w:t>
+      </w:r>
+    </w:p>
+    <w:p>
+      <w:pPr>
+        <w:numPr>
+          <w:ilvl w:val="0"/>
+          <w:numId w:val="5"/>
+        </w:numPr>
+      </w:pPr>
+      <w:r>
+        <w:t>Identifying missing values</w:t>
+      </w:r>
+    </w:p>
+    <w:p>
+      <w:pPr>
+        <w:numPr>
+          <w:ilvl w:val="0"/>
+          <w:numId w:val="5"/>
+        </w:numPr>
+      </w:pPr>
+      <w:r>
+        <w:t>Detecting duplicate records</w:t>
+      </w:r>
+    </w:p>
+    <w:p/>
+    <w:p>
+      <w:r>
+        <w:t>3. Data Cleaning</w:t>
+      </w:r>
+    </w:p>
+    <w:p>
+      <w:r>
+        <w:t>Handling Missing Values</w:t>
+      </w:r>
+    </w:p>
+    <w:p>
+      <w:r>
+        <w:t>Missing values were identified in the dataset, particularly in the quantity and salesperson columns. These were handled as follows:</w:t>
+      </w:r>
+    </w:p>
+    <w:p>
+      <w:pPr>
+        <w:numPr>
+          <w:ilvl w:val="0"/>
+          <w:numId w:val="6"/>
+        </w:numPr>
+      </w:pPr>
+      <w:r>
+        <w:t>Missing quantity values were replaced with 0</w:t>
+      </w:r>
+    </w:p>
+    <w:p>
+      <w:pPr>
+        <w:numPr>
+          <w:ilvl w:val="0"/>
+          <w:numId w:val="6"/>
+        </w:numPr>
+      </w:pPr>
+      <w:r>
+        <w:t>Missing salesperson values were replaced with "Unknown"</w:t>
+      </w:r>
+    </w:p>
+    <w:p>
+      <w:r>
+        <w:t>This approach ensured that all records were retained while maintaining consistency in the dataset.</w:t>
+      </w:r>
+    </w:p>
+    <w:p/>
+    <w:p>
+      <w:r>
+        <w:t>Removing Duplicates</w:t>
+      </w:r>
+    </w:p>
+    <w:p>
+      <w:r>
+        <w:t>Duplicate records were identified and removed using Python. This step was necessary to avoid duplicate transactions affecting the accuracy of analysis results.</w:t>
+      </w:r>
+    </w:p>
+    <w:p/>
+    <w:p/>
+    <w:p>
+      <w:r>
+        <w:lastRenderedPageBreak/>
+        <w:t>4. Data Standardisation</w:t>
+      </w:r>
+    </w:p>
+    <w:p>
+      <w:r>
+        <w:t>To ensure consistency and accuracy, the dataset was standardised:</w:t>
+      </w:r>
+    </w:p>
+    <w:p>
+      <w:pPr>
+        <w:numPr>
+          <w:ilvl w:val="0"/>
+          <w:numId w:val="7"/>
+        </w:numPr>
+      </w:pPr>
+      <w:r>
+        <w:t>The date column was converted into a proper datetime format</w:t>
+      </w:r>
+    </w:p>
+    <w:p>
+      <w:pPr>
+        <w:numPr>
+          <w:ilvl w:val="0"/>
+          <w:numId w:val="7"/>
+        </w:numPr>
+      </w:pPr>
+      <w:r>
+        <w:t>Numeric columns such as quantity and price were converted to appropriate numeric data types</w:t>
+      </w:r>
+    </w:p>
+    <w:p>
+      <w:pPr>
+        <w:numPr>
+          <w:ilvl w:val="0"/>
+          <w:numId w:val="7"/>
+        </w:numPr>
+      </w:pPr>
+      <w:r>
+        <w:t>Text fields (product, category, region, salesperson) were cleaned by removing extra spaces</w:t>
+      </w:r>
+    </w:p>
+    <w:p>
+      <w:r>
+        <w:t>These steps ensure the data is formatted correctly for grouping, calculations, and analysis.</w:t>
+      </w:r>
+    </w:p>
+    <w:p/>
+    <w:p>
+      <w:r>
+        <w:t>5. Data Validation</w:t>
+      </w:r>
+    </w:p>
+    <w:p>
+      <w:r>
+        <w:t>After cleaning and standardisation, the dataset was validated to ensure:</w:t>
+      </w:r>
+    </w:p>
+    <w:p>
+      <w:pPr>
+        <w:numPr>
+          <w:ilvl w:val="0"/>
+          <w:numId w:val="8"/>
+        </w:numPr>
+      </w:pPr>
+      <w:r>
+        <w:t>No missing values remained</w:t>
+      </w:r>
+    </w:p>
+    <w:p>
+      <w:pPr>
+        <w:numPr>
+          <w:ilvl w:val="0"/>
+          <w:numId w:val="8"/>
+        </w:numPr>
+      </w:pPr>
+      <w:r>
+        <w:t>Duplicate records were removed</w:t>
+      </w:r>
+    </w:p>
+    <w:p>
+      <w:pPr>
+        <w:numPr>
+          <w:ilvl w:val="0"/>
+          <w:numId w:val="8"/>
+        </w:numPr>
+      </w:pPr>
+      <w:r>
+        <w:t>Data types were correctly assigned</w:t>
+      </w:r>
+    </w:p>
+    <w:p>
+      <w:r>
+        <w:t>This confirmed that the dataset is clean and reliable.</w:t>
+      </w:r>
+    </w:p>
+    <w:p/>
+    <w:p/>
+    <w:p/>
+    <w:p/>
+    <w:p/>
+    <w:p/>
+    <w:p/>
+    <w:p/>
+    <w:p/>
+    <w:p/>
+    <w:p/>
+    <w:p/>
+    <w:p/>
+    <w:p>
+      <w:r>
+        <w:lastRenderedPageBreak/>
+        <w:t>Day 3 Report: Data Transformation, Aggregation and Output Generation</w:t>
+      </w:r>
+    </w:p>
+    <w:p/>
+    <w:p>
+      <w:r>
+        <w:t>1. Introduction</w:t>
+      </w:r>
+    </w:p>
+    <w:p>
+      <w:r>
+        <w:t>The purpose of Day 3 was to extend the cleaned dataset by applying data transformations and generating business-level insights through aggregation. This stage focuses on converting raw cleaned data into meaningful metrics that support decision-making, such as revenue trends and performance analysis.</w:t>
+      </w:r>
+    </w:p>
+    <w:p/>
+    <w:p>
+      <w:r>
+        <w:t>2. Data Transformation</w:t>
+      </w:r>
+    </w:p>
+    <w:p>
+      <w:r>
+        <w:t>After completing data cleaning in Day 2, additional fields were created to enhance the dataset for analysis.</w:t>
+      </w:r>
+    </w:p>
+    <w:p>
+      <w:r>
+        <w:t>Key Transformations Applied:</w:t>
+      </w:r>
+    </w:p>
+    <w:p>
+      <w:pPr>
+        <w:numPr>
+          <w:ilvl w:val="0"/>
+          <w:numId w:val="9"/>
+        </w:numPr>
+      </w:pPr>
+      <w:r>
+        <w:t xml:space="preserve">A Revenue column was created by multiplying Quantity and Price </w:t>
+      </w:r>
+    </w:p>
+    <w:p>
+      <w:pPr>
+        <w:numPr>
+          <w:ilvl w:val="0"/>
+          <w:numId w:val="9"/>
+        </w:numPr>
+      </w:pPr>
+      <w:r>
+        <w:t xml:space="preserve">A Month column was extracted from the Date field for time-based analysis </w:t>
+      </w:r>
+    </w:p>
+    <w:p>
+      <w:r>
+        <w:t>These transformations allow the dataset to support financial and trend analysis at different levels.</w:t>
+      </w:r>
+    </w:p>
+    <w:p/>
+    <w:p>
+      <w:r>
+        <w:t>3. Data Aggregation</w:t>
+      </w:r>
+    </w:p>
+    <w:p>
+      <w:r>
+        <w:t>To generate business insights, the dataset was grouped using key dimensions.</w:t>
+      </w:r>
+    </w:p>
+    <w:p>
+      <w:r>
+        <w:t>Aggregated Outputs Created:</w:t>
+      </w:r>
+    </w:p>
+    <w:p>
+      <w:pPr>
+        <w:numPr>
+          <w:ilvl w:val="0"/>
+          <w:numId w:val="10"/>
+        </w:numPr>
+      </w:pPr>
+      <w:r>
+        <w:t>Sales by Region:</w:t>
+      </w:r>
+      <w:r>
+        <w:br/>
+        <w:t xml:space="preserve">Total revenue was calculated per geographical region to identify the best-performing areas. </w:t>
+      </w:r>
+    </w:p>
+    <w:p>
+      <w:pPr>
+        <w:numPr>
+          <w:ilvl w:val="0"/>
+          <w:numId w:val="10"/>
+        </w:numPr>
+      </w:pPr>
+      <w:r>
+        <w:t>Sales by Product:</w:t>
+      </w:r>
+      <w:r>
+        <w:br/>
+        <w:t xml:space="preserve">Revenue was grouped by product to determine the highest revenue-generating items. </w:t>
+      </w:r>
+    </w:p>
+    <w:p>
+      <w:pPr>
+        <w:numPr>
+          <w:ilvl w:val="0"/>
+          <w:numId w:val="10"/>
+        </w:numPr>
+      </w:pPr>
+      <w:r>
+        <w:t>Monthly Revenue:</w:t>
+      </w:r>
+      <w:r>
+        <w:br/>
+        <w:t xml:space="preserve">Revenue was grouped by month to analyse sales trends over time. </w:t>
+      </w:r>
+    </w:p>
+    <w:p>
+      <w:pPr>
+        <w:numPr>
+          <w:ilvl w:val="0"/>
+          <w:numId w:val="10"/>
+        </w:numPr>
+      </w:pPr>
+      <w:r>
+        <w:t>Salesperson Performance:</w:t>
+      </w:r>
+      <w:r>
+        <w:br/>
+        <w:t xml:space="preserve">Revenue was grouped by salesperson to evaluate individual performance. </w:t>
+      </w:r>
+    </w:p>
+    <w:p/>
+    <w:p>
+      <w:r>
+        <w:lastRenderedPageBreak/>
+        <w:t>4. Data Filtering and Validation</w:t>
+      </w:r>
+    </w:p>
+    <w:p>
+      <w:r>
+        <w:t>Before aggregation, the dataset was further refined to ensure accuracy:</w:t>
+      </w:r>
+    </w:p>
+    <w:p>
+      <w:pPr>
+        <w:numPr>
+          <w:ilvl w:val="0"/>
+          <w:numId w:val="11"/>
+        </w:numPr>
+      </w:pPr>
+      <w:r>
+        <w:t xml:space="preserve">Duplicate records were removed </w:t>
+      </w:r>
+    </w:p>
+    <w:p>
+      <w:pPr>
+        <w:numPr>
+          <w:ilvl w:val="0"/>
+          <w:numId w:val="11"/>
+        </w:numPr>
+      </w:pPr>
+      <w:r>
+        <w:t xml:space="preserve">Missing values in categorical fields were handled </w:t>
+      </w:r>
+    </w:p>
+    <w:p>
+      <w:pPr>
+        <w:numPr>
+          <w:ilvl w:val="0"/>
+          <w:numId w:val="11"/>
+        </w:numPr>
+      </w:pPr>
+      <w:r>
+        <w:t xml:space="preserve">Missing quantities were filled and invalid transactions (quantity = 0) were removed </w:t>
+      </w:r>
+    </w:p>
+    <w:p>
+      <w:pPr>
+        <w:numPr>
+          <w:ilvl w:val="0"/>
+          <w:numId w:val="11"/>
+        </w:numPr>
+      </w:pPr>
+      <w:r>
+        <w:t xml:space="preserve">Data types were standardised for consistency (dates, numbers, and text fields) </w:t>
+      </w:r>
+    </w:p>
+    <w:p>
+      <w:r>
+        <w:t>This ensured that only valid transactions were included in the final analysis.</w:t>
+      </w:r>
+    </w:p>
+    <w:p/>
+    <w:p>
+      <w:r>
+        <w:t>5. Output Generation</w:t>
+      </w:r>
+    </w:p>
+    <w:p>
+      <w:r>
+        <w:t>The final step was exporting the processed data for reporting and visualization.</w:t>
+      </w:r>
+    </w:p>
+    <w:p>
+      <w:r>
+        <w:t>Files Generated:</w:t>
+      </w:r>
+    </w:p>
+    <w:p>
+      <w:pPr>
+        <w:numPr>
+          <w:ilvl w:val="0"/>
+          <w:numId w:val="12"/>
+        </w:numPr>
+      </w:pPr>
+      <w:r>
+        <w:t xml:space="preserve">Clean dataset: </w:t>
+      </w:r>
+    </w:p>
+    <w:p>
+      <w:pPr>
+        <w:numPr>
+          <w:ilvl w:val="1"/>
+          <w:numId w:val="12"/>
+        </w:numPr>
+      </w:pPr>
+      <w:r>
+        <w:t xml:space="preserve">clean_sales.csv </w:t>
+      </w:r>
+    </w:p>
+    <w:p>
+      <w:pPr>
+        <w:numPr>
+          <w:ilvl w:val="0"/>
+          <w:numId w:val="12"/>
+        </w:numPr>
+      </w:pPr>
+      <w:r>
+        <w:t xml:space="preserve">Aggregated datasets: </w:t>
+      </w:r>
+    </w:p>
+    <w:p>
+      <w:pPr>
+        <w:numPr>
+          <w:ilvl w:val="1"/>
+          <w:numId w:val="12"/>
+        </w:numPr>
+      </w:pPr>
+      <w:r>
+        <w:t xml:space="preserve">sales_by_region.csv </w:t>
+      </w:r>
+    </w:p>
+    <w:p>
+      <w:pPr>
+        <w:numPr>
+          <w:ilvl w:val="1"/>
+          <w:numId w:val="12"/>
+        </w:numPr>
+      </w:pPr>
+      <w:r>
+        <w:t xml:space="preserve">sales_by_product.csv </w:t>
+      </w:r>
+    </w:p>
+    <w:p>
+      <w:pPr>
+        <w:numPr>
+          <w:ilvl w:val="1"/>
+          <w:numId w:val="12"/>
+        </w:numPr>
+      </w:pPr>
+      <w:r>
+        <w:t xml:space="preserve">monthly_revenue.csv </w:t>
+      </w:r>
+    </w:p>
+    <w:p>
+      <w:pPr>
+        <w:numPr>
+          <w:ilvl w:val="1"/>
+          <w:numId w:val="12"/>
+        </w:numPr>
+      </w:pPr>
+      <w:r>
+        <w:t xml:space="preserve">salesperson_performance.csv </w:t>
+      </w:r>
+    </w:p>
+    <w:p>
+      <w:r>
+        <w:t>These outputs will be used in Excel for Pivot Tables, charts, and dashboard creation.</w:t>
+      </w:r>
+    </w:p>
+    <w:p/>
+    <w:p>
+      <w:r>
+        <w:t>6. Tools and Technologies Used</w:t>
+      </w:r>
+    </w:p>
+    <w:p>
+      <w:pPr>
+        <w:numPr>
+          <w:ilvl w:val="0"/>
+          <w:numId w:val="13"/>
+        </w:numPr>
+      </w:pPr>
+      <w:r>
+        <w:t xml:space="preserve">Python (Pandas): Data transformation and aggregation </w:t>
+      </w:r>
+    </w:p>
+    <w:p>
+      <w:pPr>
+        <w:numPr>
+          <w:ilvl w:val="0"/>
+          <w:numId w:val="13"/>
+        </w:numPr>
+      </w:pPr>
+      <w:r>
+        <w:t xml:space="preserve">Linux: File management and pipeline execution </w:t>
+      </w:r>
+    </w:p>
+    <w:p>
+      <w:pPr>
+        <w:numPr>
+          <w:ilvl w:val="0"/>
+          <w:numId w:val="13"/>
+        </w:numPr>
+      </w:pPr>
+      <w:r>
+        <w:t xml:space="preserve">Excel: Next stage for Pivot Tables and dashboard development </w:t>
+      </w:r>
+    </w:p>
     <w:p/>
     <w:sectPr>
       <w:pgSz w:w="11906" w:h="16838"/>
@@ -276,6 +872,155 @@
 <file path=word/numbering.xml><?xml version="1.0" encoding="utf-8"?>
 <w:numbering xmlns:wpc="http://schemas.microsoft.com/office/word/2010/wordprocessingCanvas" xmlns:cx="http://schemas.microsoft.com/office/drawing/2014/chartex" xmlns:cx1="http://schemas.microsoft.com/office/drawing/2015/9/8/chartex" xmlns:cx2="http://schemas.microsoft.com/office/drawing/2015/10/21/chartex" xmlns:cx3="http://schemas.microsoft.com/office/drawing/2016/5/9/chartex" xmlns:cx4="http://schemas.microsoft.com/office/drawing/2016/5/10/chartex" xmlns:cx5="http://schemas.microsoft.com/office/drawing/2016/5/11/chartex" xmlns:cx6="http://schemas.microsoft.com/office/drawing/2016/5/12/chartex" xmlns:cx7="http://schemas.microsoft.com/office/drawing/2016/5/13/chartex" xmlns:cx8="http://schemas.microsoft.com/office/drawing/2016/5/14/chartex" xmlns:mc="http://schemas.openxmlformats.org/markup-compatibility/2006" xmlns:aink="http://schemas.microsoft.com/office/drawing/2016/ink" xmlns:am3d="http://schemas.microsoft.com/office/drawing/2017/model3d" xmlns:o="urn:schemas-microsoft-com:office:office" xmlns:oel="http://schemas.microsoft.com/office/2019/extlst" xmlns:r="http://schemas.openxmlformats.org/officeDocument/2006/relationships" xmlns:m="http://schemas.openxmlformats.org/officeDocument/2006/math" xmlns:v="urn:schemas-microsoft-com:vml" xmlns:wp14="http://schemas.microsoft.com/office/word/2010/wordprocessingDrawing" xmlns:wp="http://schemas.openxmlformats.org/drawingml/2006/wordprocessingDrawing" xmlns:w10="urn:schemas-microsoft-com:office:word" xmlns:w="http://schemas.openxmlformats.org/wordprocessingml/2006/main" xmlns:w14="http://schemas.microsoft.com/office/word/2010/wordml" xmlns:w15="http://schemas.microsoft.com/office/word/2012/wordml" xmlns:w16cex="http://schemas.microsoft.com/office/word/2018/wordml/cex" xmlns:w16cid="http://schemas.microsoft.com/office/word/2016/wordml/cid" xmlns:w16="http://schemas.microsoft.com/office/word/2018/wordml" xmlns:w16du="http://schemas.microsoft.com/office/word/2023/wordml/word16du" xmlns:w16sdtdh="http://schemas.microsoft.com/office/word/2020/wordml/sdtdatahash" xmlns:w16sdtfl="http://schemas.microsoft.com/office/word/2024/wordml/sdtformatlock" xmlns:w16se="http://schemas.microsoft.com/office/word/2015/wordml/symex" xmlns:wpg="http://schemas.microsoft.com/office/word/2010/wordprocessingGroup" xmlns:wpi="http://schemas.microsoft.com/office/word/2010/wordprocessingInk" xmlns:wne="http://schemas.microsoft.com/office/word/2006/wordml" xmlns:wps="http://schemas.microsoft.com/office/word/2010/wordprocessingShape" mc:Ignorable="w14 w15 w16se w16cid w16 w16cex w16sdtdh w16sdtfl w16du wp14">
   <w:abstractNum w:abstractNumId="0" w15:restartNumberingAfterBreak="0">
+    <w:nsid w:val="12D23498"/>
+    <w:multiLevelType w:val="multilevel"/>
+    <w:tmpl w:val="F86E3086"/>
+    <w:lvl w:ilvl="0">
+      <w:start w:val="1"/>
+      <w:numFmt w:val="bullet"/>
+      <w:lvlText w:val=""/>
+      <w:lvlJc w:val="left"/>
+      <w:pPr>
+        <w:tabs>
+          <w:tab w:val="num" w:pos="720"/>
+        </w:tabs>
+        <w:ind w:left="720" w:hanging="360"/>
+      </w:pPr>
+      <w:rPr>
+        <w:rFonts w:ascii="Symbol" w:hAnsi="Symbol" w:hint="default"/>
+        <w:sz w:val="20"/>
+      </w:rPr>
+    </w:lvl>
+    <w:lvl w:ilvl="1">
+      <w:start w:val="1"/>
+      <w:numFmt w:val="bullet"/>
+      <w:lvlText w:val="o"/>
+      <w:lvlJc w:val="left"/>
+      <w:pPr>
+        <w:tabs>
+          <w:tab w:val="num" w:pos="1440"/>
+        </w:tabs>
+        <w:ind w:left="1440" w:hanging="360"/>
+      </w:pPr>
+      <w:rPr>
+        <w:rFonts w:ascii="Courier New" w:hAnsi="Courier New" w:hint="default"/>
+        <w:sz w:val="20"/>
+      </w:rPr>
+    </w:lvl>
+    <w:lvl w:ilvl="2" w:tentative="1">
+      <w:start w:val="1"/>
+      <w:numFmt w:val="bullet"/>
+      <w:lvlText w:val=""/>
+      <w:lvlJc w:val="left"/>
+      <w:pPr>
+        <w:tabs>
+          <w:tab w:val="num" w:pos="2160"/>
+        </w:tabs>
+        <w:ind w:left="2160" w:hanging="360"/>
+      </w:pPr>
+      <w:rPr>
+        <w:rFonts w:ascii="Wingdings" w:hAnsi="Wingdings" w:hint="default"/>
+        <w:sz w:val="20"/>
+      </w:rPr>
+    </w:lvl>
+    <w:lvl w:ilvl="3" w:tentative="1">
+      <w:start w:val="1"/>
+      <w:numFmt w:val="bullet"/>
+      <w:lvlText w:val=""/>
+      <w:lvlJc w:val="left"/>
+      <w:pPr>
+        <w:tabs>
+          <w:tab w:val="num" w:pos="2880"/>
+        </w:tabs>
+        <w:ind w:left="2880" w:hanging="360"/>
+      </w:pPr>
+      <w:rPr>
+        <w:rFonts w:ascii="Wingdings" w:hAnsi="Wingdings" w:hint="default"/>
+        <w:sz w:val="20"/>
+      </w:rPr>
+    </w:lvl>
+    <w:lvl w:ilvl="4" w:tentative="1">
+      <w:start w:val="1"/>
+      <w:numFmt w:val="bullet"/>
+      <w:lvlText w:val=""/>
+      <w:lvlJc w:val="left"/>
+      <w:pPr>
+        <w:tabs>
+          <w:tab w:val="num" w:pos="3600"/>
+        </w:tabs>
+        <w:ind w:left="3600" w:hanging="360"/>
+      </w:pPr>
+      <w:rPr>
+        <w:rFonts w:ascii="Wingdings" w:hAnsi="Wingdings" w:hint="default"/>
+        <w:sz w:val="20"/>
+      </w:rPr>
+    </w:lvl>
+    <w:lvl w:ilvl="5" w:tentative="1">
+      <w:start w:val="1"/>
+      <w:numFmt w:val="bullet"/>
+      <w:lvlText w:val=""/>
+      <w:lvlJc w:val="left"/>
+      <w:pPr>
+        <w:tabs>
+          <w:tab w:val="num" w:pos="4320"/>
+        </w:tabs>
+        <w:ind w:left="4320" w:hanging="360"/>
+      </w:pPr>
+      <w:rPr>
+        <w:rFonts w:ascii="Wingdings" w:hAnsi="Wingdings" w:hint="default"/>
+        <w:sz w:val="20"/>
+      </w:rPr>
+    </w:lvl>
+    <w:lvl w:ilvl="6" w:tentative="1">
+      <w:start w:val="1"/>
+      <w:numFmt w:val="bullet"/>
+      <w:lvlText w:val=""/>
+      <w:lvlJc w:val="left"/>
+      <w:pPr>
+        <w:tabs>
+          <w:tab w:val="num" w:pos="5040"/>
+        </w:tabs>
+        <w:ind w:left="5040" w:hanging="360"/>
+      </w:pPr>
+      <w:rPr>
+        <w:rFonts w:ascii="Wingdings" w:hAnsi="Wingdings" w:hint="default"/>
+        <w:sz w:val="20"/>
+      </w:rPr>
+    </w:lvl>
+    <w:lvl w:ilvl="7" w:tentative="1">
+      <w:start w:val="1"/>
+      <w:numFmt w:val="bullet"/>
+      <w:lvlText w:val=""/>
+      <w:lvlJc w:val="left"/>
+      <w:pPr>
+        <w:tabs>
+          <w:tab w:val="num" w:pos="5760"/>
+        </w:tabs>
+        <w:ind w:left="5760" w:hanging="360"/>
+      </w:pPr>
+      <w:rPr>
+        <w:rFonts w:ascii="Wingdings" w:hAnsi="Wingdings" w:hint="default"/>
+        <w:sz w:val="20"/>
+      </w:rPr>
+    </w:lvl>
+    <w:lvl w:ilvl="8" w:tentative="1">
+      <w:start w:val="1"/>
+      <w:numFmt w:val="bullet"/>
+      <w:lvlText w:val=""/>
+      <w:lvlJc w:val="left"/>
+      <w:pPr>
+        <w:tabs>
+          <w:tab w:val="num" w:pos="6480"/>
+        </w:tabs>
+        <w:ind w:left="6480" w:hanging="360"/>
+      </w:pPr>
+      <w:rPr>
+        <w:rFonts w:ascii="Wingdings" w:hAnsi="Wingdings" w:hint="default"/>
+        <w:sz w:val="20"/>
+      </w:rPr>
+    </w:lvl>
+  </w:abstractNum>
+  <w:abstractNum w:abstractNumId="1" w15:restartNumberingAfterBreak="0">
     <w:nsid w:val="20465010"/>
     <w:multiLevelType w:val="multilevel"/>
     <w:tmpl w:val="68DAD3CC"/>
@@ -424,7 +1169,156 @@
       </w:rPr>
     </w:lvl>
   </w:abstractNum>
-  <w:abstractNum w:abstractNumId="1" w15:restartNumberingAfterBreak="0">
+  <w:abstractNum w:abstractNumId="2" w15:restartNumberingAfterBreak="0">
+    <w:nsid w:val="29F67E37"/>
+    <w:multiLevelType w:val="multilevel"/>
+    <w:tmpl w:val="ACF8520C"/>
+    <w:lvl w:ilvl="0">
+      <w:start w:val="1"/>
+      <w:numFmt w:val="bullet"/>
+      <w:lvlText w:val=""/>
+      <w:lvlJc w:val="left"/>
+      <w:pPr>
+        <w:tabs>
+          <w:tab w:val="num" w:pos="720"/>
+        </w:tabs>
+        <w:ind w:left="720" w:hanging="360"/>
+      </w:pPr>
+      <w:rPr>
+        <w:rFonts w:ascii="Symbol" w:hAnsi="Symbol" w:hint="default"/>
+        <w:sz w:val="20"/>
+      </w:rPr>
+    </w:lvl>
+    <w:lvl w:ilvl="1" w:tentative="1">
+      <w:start w:val="1"/>
+      <w:numFmt w:val="bullet"/>
+      <w:lvlText w:val="o"/>
+      <w:lvlJc w:val="left"/>
+      <w:pPr>
+        <w:tabs>
+          <w:tab w:val="num" w:pos="1440"/>
+        </w:tabs>
+        <w:ind w:left="1440" w:hanging="360"/>
+      </w:pPr>
+      <w:rPr>
+        <w:rFonts w:ascii="Courier New" w:hAnsi="Courier New" w:hint="default"/>
+        <w:sz w:val="20"/>
+      </w:rPr>
+    </w:lvl>
+    <w:lvl w:ilvl="2" w:tentative="1">
+      <w:start w:val="1"/>
+      <w:numFmt w:val="bullet"/>
+      <w:lvlText w:val=""/>
+      <w:lvlJc w:val="left"/>
+      <w:pPr>
+        <w:tabs>
+          <w:tab w:val="num" w:pos="2160"/>
+        </w:tabs>
+        <w:ind w:left="2160" w:hanging="360"/>
+      </w:pPr>
+      <w:rPr>
+        <w:rFonts w:ascii="Wingdings" w:hAnsi="Wingdings" w:hint="default"/>
+        <w:sz w:val="20"/>
+      </w:rPr>
+    </w:lvl>
+    <w:lvl w:ilvl="3" w:tentative="1">
+      <w:start w:val="1"/>
+      <w:numFmt w:val="bullet"/>
+      <w:lvlText w:val=""/>
+      <w:lvlJc w:val="left"/>
+      <w:pPr>
+        <w:tabs>
+          <w:tab w:val="num" w:pos="2880"/>
+        </w:tabs>
+        <w:ind w:left="2880" w:hanging="360"/>
+      </w:pPr>
+      <w:rPr>
+        <w:rFonts w:ascii="Wingdings" w:hAnsi="Wingdings" w:hint="default"/>
+        <w:sz w:val="20"/>
+      </w:rPr>
+    </w:lvl>
+    <w:lvl w:ilvl="4" w:tentative="1">
+      <w:start w:val="1"/>
+      <w:numFmt w:val="bullet"/>
+      <w:lvlText w:val=""/>
+      <w:lvlJc w:val="left"/>
+      <w:pPr>
+        <w:tabs>
+          <w:tab w:val="num" w:pos="3600"/>
+        </w:tabs>
+        <w:ind w:left="3600" w:hanging="360"/>
+      </w:pPr>
+      <w:rPr>
+        <w:rFonts w:ascii="Wingdings" w:hAnsi="Wingdings" w:hint="default"/>
+        <w:sz w:val="20"/>
+      </w:rPr>
+    </w:lvl>
+    <w:lvl w:ilvl="5" w:tentative="1">
+      <w:start w:val="1"/>
+      <w:numFmt w:val="bullet"/>
+      <w:lvlText w:val=""/>
+      <w:lvlJc w:val="left"/>
+      <w:pPr>
+        <w:tabs>
+          <w:tab w:val="num" w:pos="4320"/>
+        </w:tabs>
+        <w:ind w:left="4320" w:hanging="360"/>
+      </w:pPr>
+      <w:rPr>
+        <w:rFonts w:ascii="Wingdings" w:hAnsi="Wingdings" w:hint="default"/>
+        <w:sz w:val="20"/>
+      </w:rPr>
+    </w:lvl>
+    <w:lvl w:ilvl="6" w:tentative="1">
+      <w:start w:val="1"/>
+      <w:numFmt w:val="bullet"/>
+      <w:lvlText w:val=""/>
+      <w:lvlJc w:val="left"/>
+      <w:pPr>
+        <w:tabs>
+          <w:tab w:val="num" w:pos="5040"/>
+        </w:tabs>
+        <w:ind w:left="5040" w:hanging="360"/>
+      </w:pPr>
+      <w:rPr>
+        <w:rFonts w:ascii="Wingdings" w:hAnsi="Wingdings" w:hint="default"/>
+        <w:sz w:val="20"/>
+      </w:rPr>
+    </w:lvl>
+    <w:lvl w:ilvl="7" w:tentative="1">
+      <w:start w:val="1"/>
+      <w:numFmt w:val="bullet"/>
+      <w:lvlText w:val=""/>
+      <w:lvlJc w:val="left"/>
+      <w:pPr>
+        <w:tabs>
+          <w:tab w:val="num" w:pos="5760"/>
+        </w:tabs>
+        <w:ind w:left="5760" w:hanging="360"/>
+      </w:pPr>
+      <w:rPr>
+        <w:rFonts w:ascii="Wingdings" w:hAnsi="Wingdings" w:hint="default"/>
+        <w:sz w:val="20"/>
+      </w:rPr>
+    </w:lvl>
+    <w:lvl w:ilvl="8" w:tentative="1">
+      <w:start w:val="1"/>
+      <w:numFmt w:val="bullet"/>
+      <w:lvlText w:val=""/>
+      <w:lvlJc w:val="left"/>
+      <w:pPr>
+        <w:tabs>
+          <w:tab w:val="num" w:pos="6480"/>
+        </w:tabs>
+        <w:ind w:left="6480" w:hanging="360"/>
+      </w:pPr>
+      <w:rPr>
+        <w:rFonts w:ascii="Wingdings" w:hAnsi="Wingdings" w:hint="default"/>
+        <w:sz w:val="20"/>
+      </w:rPr>
+    </w:lvl>
+  </w:abstractNum>
+  <w:abstractNum w:abstractNumId="3" w15:restartNumberingAfterBreak="0">
     <w:nsid w:val="32B6325C"/>
     <w:multiLevelType w:val="multilevel"/>
     <w:tmpl w:val="819E2EC0"/>
@@ -573,7 +1467,603 @@
       </w:rPr>
     </w:lvl>
   </w:abstractNum>
-  <w:abstractNum w:abstractNumId="2" w15:restartNumberingAfterBreak="0">
+  <w:abstractNum w:abstractNumId="4" w15:restartNumberingAfterBreak="0">
+    <w:nsid w:val="36576AE9"/>
+    <w:multiLevelType w:val="multilevel"/>
+    <w:tmpl w:val="8C8AFCE6"/>
+    <w:lvl w:ilvl="0">
+      <w:start w:val="1"/>
+      <w:numFmt w:val="bullet"/>
+      <w:lvlText w:val=""/>
+      <w:lvlJc w:val="left"/>
+      <w:pPr>
+        <w:tabs>
+          <w:tab w:val="num" w:pos="720"/>
+        </w:tabs>
+        <w:ind w:left="720" w:hanging="360"/>
+      </w:pPr>
+      <w:rPr>
+        <w:rFonts w:ascii="Symbol" w:hAnsi="Symbol" w:hint="default"/>
+        <w:sz w:val="20"/>
+      </w:rPr>
+    </w:lvl>
+    <w:lvl w:ilvl="1" w:tentative="1">
+      <w:start w:val="1"/>
+      <w:numFmt w:val="bullet"/>
+      <w:lvlText w:val="o"/>
+      <w:lvlJc w:val="left"/>
+      <w:pPr>
+        <w:tabs>
+          <w:tab w:val="num" w:pos="1440"/>
+        </w:tabs>
+        <w:ind w:left="1440" w:hanging="360"/>
+      </w:pPr>
+      <w:rPr>
+        <w:rFonts w:ascii="Courier New" w:hAnsi="Courier New" w:hint="default"/>
+        <w:sz w:val="20"/>
+      </w:rPr>
+    </w:lvl>
+    <w:lvl w:ilvl="2" w:tentative="1">
+      <w:start w:val="1"/>
+      <w:numFmt w:val="bullet"/>
+      <w:lvlText w:val=""/>
+      <w:lvlJc w:val="left"/>
+      <w:pPr>
+        <w:tabs>
+          <w:tab w:val="num" w:pos="2160"/>
+        </w:tabs>
+        <w:ind w:left="2160" w:hanging="360"/>
+      </w:pPr>
+      <w:rPr>
+        <w:rFonts w:ascii="Wingdings" w:hAnsi="Wingdings" w:hint="default"/>
+        <w:sz w:val="20"/>
+      </w:rPr>
+    </w:lvl>
+    <w:lvl w:ilvl="3" w:tentative="1">
+      <w:start w:val="1"/>
+      <w:numFmt w:val="bullet"/>
+      <w:lvlText w:val=""/>
+      <w:lvlJc w:val="left"/>
+      <w:pPr>
+        <w:tabs>
+          <w:tab w:val="num" w:pos="2880"/>
+        </w:tabs>
+        <w:ind w:left="2880" w:hanging="360"/>
+      </w:pPr>
+      <w:rPr>
+        <w:rFonts w:ascii="Wingdings" w:hAnsi="Wingdings" w:hint="default"/>
+        <w:sz w:val="20"/>
+      </w:rPr>
+    </w:lvl>
+    <w:lvl w:ilvl="4" w:tentative="1">
+      <w:start w:val="1"/>
+      <w:numFmt w:val="bullet"/>
+      <w:lvlText w:val=""/>
+      <w:lvlJc w:val="left"/>
+      <w:pPr>
+        <w:tabs>
+          <w:tab w:val="num" w:pos="3600"/>
+        </w:tabs>
+        <w:ind w:left="3600" w:hanging="360"/>
+      </w:pPr>
+      <w:rPr>
+        <w:rFonts w:ascii="Wingdings" w:hAnsi="Wingdings" w:hint="default"/>
+        <w:sz w:val="20"/>
+      </w:rPr>
+    </w:lvl>
+    <w:lvl w:ilvl="5" w:tentative="1">
+      <w:start w:val="1"/>
+      <w:numFmt w:val="bullet"/>
+      <w:lvlText w:val=""/>
+      <w:lvlJc w:val="left"/>
+      <w:pPr>
+        <w:tabs>
+          <w:tab w:val="num" w:pos="4320"/>
+        </w:tabs>
+        <w:ind w:left="4320" w:hanging="360"/>
+      </w:pPr>
+      <w:rPr>
+        <w:rFonts w:ascii="Wingdings" w:hAnsi="Wingdings" w:hint="default"/>
+        <w:sz w:val="20"/>
+      </w:rPr>
+    </w:lvl>
+    <w:lvl w:ilvl="6" w:tentative="1">
+      <w:start w:val="1"/>
+      <w:numFmt w:val="bullet"/>
+      <w:lvlText w:val=""/>
+      <w:lvlJc w:val="left"/>
+      <w:pPr>
+        <w:tabs>
+          <w:tab w:val="num" w:pos="5040"/>
+        </w:tabs>
+        <w:ind w:left="5040" w:hanging="360"/>
+      </w:pPr>
+      <w:rPr>
+        <w:rFonts w:ascii="Wingdings" w:hAnsi="Wingdings" w:hint="default"/>
+        <w:sz w:val="20"/>
+      </w:rPr>
+    </w:lvl>
+    <w:lvl w:ilvl="7" w:tentative="1">
+      <w:start w:val="1"/>
+      <w:numFmt w:val="bullet"/>
+      <w:lvlText w:val=""/>
+      <w:lvlJc w:val="left"/>
+      <w:pPr>
+        <w:tabs>
+          <w:tab w:val="num" w:pos="5760"/>
+        </w:tabs>
+        <w:ind w:left="5760" w:hanging="360"/>
+      </w:pPr>
+      <w:rPr>
+        <w:rFonts w:ascii="Wingdings" w:hAnsi="Wingdings" w:hint="default"/>
+        <w:sz w:val="20"/>
+      </w:rPr>
+    </w:lvl>
+    <w:lvl w:ilvl="8" w:tentative="1">
+      <w:start w:val="1"/>
+      <w:numFmt w:val="bullet"/>
+      <w:lvlText w:val=""/>
+      <w:lvlJc w:val="left"/>
+      <w:pPr>
+        <w:tabs>
+          <w:tab w:val="num" w:pos="6480"/>
+        </w:tabs>
+        <w:ind w:left="6480" w:hanging="360"/>
+      </w:pPr>
+      <w:rPr>
+        <w:rFonts w:ascii="Wingdings" w:hAnsi="Wingdings" w:hint="default"/>
+        <w:sz w:val="20"/>
+      </w:rPr>
+    </w:lvl>
+  </w:abstractNum>
+  <w:abstractNum w:abstractNumId="5" w15:restartNumberingAfterBreak="0">
+    <w:nsid w:val="3BE638F5"/>
+    <w:multiLevelType w:val="multilevel"/>
+    <w:tmpl w:val="7B6C3AAE"/>
+    <w:lvl w:ilvl="0">
+      <w:start w:val="1"/>
+      <w:numFmt w:val="bullet"/>
+      <w:lvlText w:val=""/>
+      <w:lvlJc w:val="left"/>
+      <w:pPr>
+        <w:tabs>
+          <w:tab w:val="num" w:pos="720"/>
+        </w:tabs>
+        <w:ind w:left="720" w:hanging="360"/>
+      </w:pPr>
+      <w:rPr>
+        <w:rFonts w:ascii="Symbol" w:hAnsi="Symbol" w:hint="default"/>
+        <w:sz w:val="20"/>
+      </w:rPr>
+    </w:lvl>
+    <w:lvl w:ilvl="1" w:tentative="1">
+      <w:start w:val="1"/>
+      <w:numFmt w:val="bullet"/>
+      <w:lvlText w:val="o"/>
+      <w:lvlJc w:val="left"/>
+      <w:pPr>
+        <w:tabs>
+          <w:tab w:val="num" w:pos="1440"/>
+        </w:tabs>
+        <w:ind w:left="1440" w:hanging="360"/>
+      </w:pPr>
+      <w:rPr>
+        <w:rFonts w:ascii="Courier New" w:hAnsi="Courier New" w:hint="default"/>
+        <w:sz w:val="20"/>
+      </w:rPr>
+    </w:lvl>
+    <w:lvl w:ilvl="2" w:tentative="1">
+      <w:start w:val="1"/>
+      <w:numFmt w:val="bullet"/>
+      <w:lvlText w:val=""/>
+      <w:lvlJc w:val="left"/>
+      <w:pPr>
+        <w:tabs>
+          <w:tab w:val="num" w:pos="2160"/>
+        </w:tabs>
+        <w:ind w:left="2160" w:hanging="360"/>
+      </w:pPr>
+      <w:rPr>
+        <w:rFonts w:ascii="Wingdings" w:hAnsi="Wingdings" w:hint="default"/>
+        <w:sz w:val="20"/>
+      </w:rPr>
+    </w:lvl>
+    <w:lvl w:ilvl="3" w:tentative="1">
+      <w:start w:val="1"/>
+      <w:numFmt w:val="bullet"/>
+      <w:lvlText w:val=""/>
+      <w:lvlJc w:val="left"/>
+      <w:pPr>
+        <w:tabs>
+          <w:tab w:val="num" w:pos="2880"/>
+        </w:tabs>
+        <w:ind w:left="2880" w:hanging="360"/>
+      </w:pPr>
+      <w:rPr>
+        <w:rFonts w:ascii="Wingdings" w:hAnsi="Wingdings" w:hint="default"/>
+        <w:sz w:val="20"/>
+      </w:rPr>
+    </w:lvl>
+    <w:lvl w:ilvl="4" w:tentative="1">
+      <w:start w:val="1"/>
+      <w:numFmt w:val="bullet"/>
+      <w:lvlText w:val=""/>
+      <w:lvlJc w:val="left"/>
+      <w:pPr>
+        <w:tabs>
+          <w:tab w:val="num" w:pos="3600"/>
+        </w:tabs>
+        <w:ind w:left="3600" w:hanging="360"/>
+      </w:pPr>
+      <w:rPr>
+        <w:rFonts w:ascii="Wingdings" w:hAnsi="Wingdings" w:hint="default"/>
+        <w:sz w:val="20"/>
+      </w:rPr>
+    </w:lvl>
+    <w:lvl w:ilvl="5" w:tentative="1">
+      <w:start w:val="1"/>
+      <w:numFmt w:val="bullet"/>
+      <w:lvlText w:val=""/>
+      <w:lvlJc w:val="left"/>
+      <w:pPr>
+        <w:tabs>
+          <w:tab w:val="num" w:pos="4320"/>
+        </w:tabs>
+        <w:ind w:left="4320" w:hanging="360"/>
+      </w:pPr>
+      <w:rPr>
+        <w:rFonts w:ascii="Wingdings" w:hAnsi="Wingdings" w:hint="default"/>
+        <w:sz w:val="20"/>
+      </w:rPr>
+    </w:lvl>
+    <w:lvl w:ilvl="6" w:tentative="1">
+      <w:start w:val="1"/>
+      <w:numFmt w:val="bullet"/>
+      <w:lvlText w:val=""/>
+      <w:lvlJc w:val="left"/>
+      <w:pPr>
+        <w:tabs>
+          <w:tab w:val="num" w:pos="5040"/>
+        </w:tabs>
+        <w:ind w:left="5040" w:hanging="360"/>
+      </w:pPr>
+      <w:rPr>
+        <w:rFonts w:ascii="Wingdings" w:hAnsi="Wingdings" w:hint="default"/>
+        <w:sz w:val="20"/>
+      </w:rPr>
+    </w:lvl>
+    <w:lvl w:ilvl="7" w:tentative="1">
+      <w:start w:val="1"/>
+      <w:numFmt w:val="bullet"/>
+      <w:lvlText w:val=""/>
+      <w:lvlJc w:val="left"/>
+      <w:pPr>
+        <w:tabs>
+          <w:tab w:val="num" w:pos="5760"/>
+        </w:tabs>
+        <w:ind w:left="5760" w:hanging="360"/>
+      </w:pPr>
+      <w:rPr>
+        <w:rFonts w:ascii="Wingdings" w:hAnsi="Wingdings" w:hint="default"/>
+        <w:sz w:val="20"/>
+      </w:rPr>
+    </w:lvl>
+    <w:lvl w:ilvl="8" w:tentative="1">
+      <w:start w:val="1"/>
+      <w:numFmt w:val="bullet"/>
+      <w:lvlText w:val=""/>
+      <w:lvlJc w:val="left"/>
+      <w:pPr>
+        <w:tabs>
+          <w:tab w:val="num" w:pos="6480"/>
+        </w:tabs>
+        <w:ind w:left="6480" w:hanging="360"/>
+      </w:pPr>
+      <w:rPr>
+        <w:rFonts w:ascii="Wingdings" w:hAnsi="Wingdings" w:hint="default"/>
+        <w:sz w:val="20"/>
+      </w:rPr>
+    </w:lvl>
+  </w:abstractNum>
+  <w:abstractNum w:abstractNumId="6" w15:restartNumberingAfterBreak="0">
+    <w:nsid w:val="5AD7207A"/>
+    <w:multiLevelType w:val="multilevel"/>
+    <w:tmpl w:val="2AAA2710"/>
+    <w:lvl w:ilvl="0">
+      <w:start w:val="1"/>
+      <w:numFmt w:val="bullet"/>
+      <w:lvlText w:val=""/>
+      <w:lvlJc w:val="left"/>
+      <w:pPr>
+        <w:tabs>
+          <w:tab w:val="num" w:pos="720"/>
+        </w:tabs>
+        <w:ind w:left="720" w:hanging="360"/>
+      </w:pPr>
+      <w:rPr>
+        <w:rFonts w:ascii="Symbol" w:hAnsi="Symbol" w:hint="default"/>
+        <w:sz w:val="20"/>
+      </w:rPr>
+    </w:lvl>
+    <w:lvl w:ilvl="1" w:tentative="1">
+      <w:start w:val="1"/>
+      <w:numFmt w:val="bullet"/>
+      <w:lvlText w:val="o"/>
+      <w:lvlJc w:val="left"/>
+      <w:pPr>
+        <w:tabs>
+          <w:tab w:val="num" w:pos="1440"/>
+        </w:tabs>
+        <w:ind w:left="1440" w:hanging="360"/>
+      </w:pPr>
+      <w:rPr>
+        <w:rFonts w:ascii="Courier New" w:hAnsi="Courier New" w:hint="default"/>
+        <w:sz w:val="20"/>
+      </w:rPr>
+    </w:lvl>
+    <w:lvl w:ilvl="2" w:tentative="1">
+      <w:start w:val="1"/>
+      <w:numFmt w:val="bullet"/>
+      <w:lvlText w:val=""/>
+      <w:lvlJc w:val="left"/>
+      <w:pPr>
+        <w:tabs>
+          <w:tab w:val="num" w:pos="2160"/>
+        </w:tabs>
+        <w:ind w:left="2160" w:hanging="360"/>
+      </w:pPr>
+      <w:rPr>
+        <w:rFonts w:ascii="Wingdings" w:hAnsi="Wingdings" w:hint="default"/>
+        <w:sz w:val="20"/>
+      </w:rPr>
+    </w:lvl>
+    <w:lvl w:ilvl="3" w:tentative="1">
+      <w:start w:val="1"/>
+      <w:numFmt w:val="bullet"/>
+      <w:lvlText w:val=""/>
+      <w:lvlJc w:val="left"/>
+      <w:pPr>
+        <w:tabs>
+          <w:tab w:val="num" w:pos="2880"/>
+        </w:tabs>
+        <w:ind w:left="2880" w:hanging="360"/>
+      </w:pPr>
+      <w:rPr>
+        <w:rFonts w:ascii="Wingdings" w:hAnsi="Wingdings" w:hint="default"/>
+        <w:sz w:val="20"/>
+      </w:rPr>
+    </w:lvl>
+    <w:lvl w:ilvl="4" w:tentative="1">
+      <w:start w:val="1"/>
+      <w:numFmt w:val="bullet"/>
+      <w:lvlText w:val=""/>
+      <w:lvlJc w:val="left"/>
+      <w:pPr>
+        <w:tabs>
+          <w:tab w:val="num" w:pos="3600"/>
+        </w:tabs>
+        <w:ind w:left="3600" w:hanging="360"/>
+      </w:pPr>
+      <w:rPr>
+        <w:rFonts w:ascii="Wingdings" w:hAnsi="Wingdings" w:hint="default"/>
+        <w:sz w:val="20"/>
+      </w:rPr>
+    </w:lvl>
+    <w:lvl w:ilvl="5" w:tentative="1">
+      <w:start w:val="1"/>
+      <w:numFmt w:val="bullet"/>
+      <w:lvlText w:val=""/>
+      <w:lvlJc w:val="left"/>
+      <w:pPr>
+        <w:tabs>
+          <w:tab w:val="num" w:pos="4320"/>
+        </w:tabs>
+        <w:ind w:left="4320" w:hanging="360"/>
+      </w:pPr>
+      <w:rPr>
+        <w:rFonts w:ascii="Wingdings" w:hAnsi="Wingdings" w:hint="default"/>
+        <w:sz w:val="20"/>
+      </w:rPr>
+    </w:lvl>
+    <w:lvl w:ilvl="6" w:tentative="1">
+      <w:start w:val="1"/>
+      <w:numFmt w:val="bullet"/>
+      <w:lvlText w:val=""/>
+      <w:lvlJc w:val="left"/>
+      <w:pPr>
+        <w:tabs>
+          <w:tab w:val="num" w:pos="5040"/>
+        </w:tabs>
+        <w:ind w:left="5040" w:hanging="360"/>
+      </w:pPr>
+      <w:rPr>
+        <w:rFonts w:ascii="Wingdings" w:hAnsi="Wingdings" w:hint="default"/>
+        <w:sz w:val="20"/>
+      </w:rPr>
+    </w:lvl>
+    <w:lvl w:ilvl="7" w:tentative="1">
+      <w:start w:val="1"/>
+      <w:numFmt w:val="bullet"/>
+      <w:lvlText w:val=""/>
+      <w:lvlJc w:val="left"/>
+      <w:pPr>
+        <w:tabs>
+          <w:tab w:val="num" w:pos="5760"/>
+        </w:tabs>
+        <w:ind w:left="5760" w:hanging="360"/>
+      </w:pPr>
+      <w:rPr>
+        <w:rFonts w:ascii="Wingdings" w:hAnsi="Wingdings" w:hint="default"/>
+        <w:sz w:val="20"/>
+      </w:rPr>
+    </w:lvl>
+    <w:lvl w:ilvl="8" w:tentative="1">
+      <w:start w:val="1"/>
+      <w:numFmt w:val="bullet"/>
+      <w:lvlText w:val=""/>
+      <w:lvlJc w:val="left"/>
+      <w:pPr>
+        <w:tabs>
+          <w:tab w:val="num" w:pos="6480"/>
+        </w:tabs>
+        <w:ind w:left="6480" w:hanging="360"/>
+      </w:pPr>
+      <w:rPr>
+        <w:rFonts w:ascii="Wingdings" w:hAnsi="Wingdings" w:hint="default"/>
+        <w:sz w:val="20"/>
+      </w:rPr>
+    </w:lvl>
+  </w:abstractNum>
+  <w:abstractNum w:abstractNumId="7" w15:restartNumberingAfterBreak="0">
+    <w:nsid w:val="60486A0A"/>
+    <w:multiLevelType w:val="multilevel"/>
+    <w:tmpl w:val="8B281766"/>
+    <w:lvl w:ilvl="0">
+      <w:start w:val="1"/>
+      <w:numFmt w:val="bullet"/>
+      <w:lvlText w:val=""/>
+      <w:lvlJc w:val="left"/>
+      <w:pPr>
+        <w:tabs>
+          <w:tab w:val="num" w:pos="720"/>
+        </w:tabs>
+        <w:ind w:left="720" w:hanging="360"/>
+      </w:pPr>
+      <w:rPr>
+        <w:rFonts w:ascii="Symbol" w:hAnsi="Symbol" w:hint="default"/>
+        <w:sz w:val="20"/>
+      </w:rPr>
+    </w:lvl>
+    <w:lvl w:ilvl="1" w:tentative="1">
+      <w:start w:val="1"/>
+      <w:numFmt w:val="bullet"/>
+      <w:lvlText w:val="o"/>
+      <w:lvlJc w:val="left"/>
+      <w:pPr>
+        <w:tabs>
+          <w:tab w:val="num" w:pos="1440"/>
+        </w:tabs>
+        <w:ind w:left="1440" w:hanging="360"/>
+      </w:pPr>
+      <w:rPr>
+        <w:rFonts w:ascii="Courier New" w:hAnsi="Courier New" w:hint="default"/>
+        <w:sz w:val="20"/>
+      </w:rPr>
+    </w:lvl>
+    <w:lvl w:ilvl="2" w:tentative="1">
+      <w:start w:val="1"/>
+      <w:numFmt w:val="bullet"/>
+      <w:lvlText w:val=""/>
+      <w:lvlJc w:val="left"/>
+      <w:pPr>
+        <w:tabs>
+          <w:tab w:val="num" w:pos="2160"/>
+        </w:tabs>
+        <w:ind w:left="2160" w:hanging="360"/>
+      </w:pPr>
+      <w:rPr>
+        <w:rFonts w:ascii="Wingdings" w:hAnsi="Wingdings" w:hint="default"/>
+        <w:sz w:val="20"/>
+      </w:rPr>
+    </w:lvl>
+    <w:lvl w:ilvl="3" w:tentative="1">
+      <w:start w:val="1"/>
+      <w:numFmt w:val="bullet"/>
+      <w:lvlText w:val=""/>
+      <w:lvlJc w:val="left"/>
+      <w:pPr>
+        <w:tabs>
+          <w:tab w:val="num" w:pos="2880"/>
+        </w:tabs>
+        <w:ind w:left="2880" w:hanging="360"/>
+      </w:pPr>
+      <w:rPr>
+        <w:rFonts w:ascii="Wingdings" w:hAnsi="Wingdings" w:hint="default"/>
+        <w:sz w:val="20"/>
+      </w:rPr>
+    </w:lvl>
+    <w:lvl w:ilvl="4" w:tentative="1">
+      <w:start w:val="1"/>
+      <w:numFmt w:val="bullet"/>
+      <w:lvlText w:val=""/>
+      <w:lvlJc w:val="left"/>
+      <w:pPr>
+        <w:tabs>
+          <w:tab w:val="num" w:pos="3600"/>
+        </w:tabs>
+        <w:ind w:left="3600" w:hanging="360"/>
+      </w:pPr>
+      <w:rPr>
+        <w:rFonts w:ascii="Wingdings" w:hAnsi="Wingdings" w:hint="default"/>
+        <w:sz w:val="20"/>
+      </w:rPr>
+    </w:lvl>
+    <w:lvl w:ilvl="5" w:tentative="1">
+      <w:start w:val="1"/>
+      <w:numFmt w:val="bullet"/>
+      <w:lvlText w:val=""/>
+      <w:lvlJc w:val="left"/>
+      <w:pPr>
+        <w:tabs>
+          <w:tab w:val="num" w:pos="4320"/>
+        </w:tabs>
+        <w:ind w:left="4320" w:hanging="360"/>
+      </w:pPr>
+      <w:rPr>
+        <w:rFonts w:ascii="Wingdings" w:hAnsi="Wingdings" w:hint="default"/>
+        <w:sz w:val="20"/>
+      </w:rPr>
+    </w:lvl>
+    <w:lvl w:ilvl="6" w:tentative="1">
+      <w:start w:val="1"/>
+      <w:numFmt w:val="bullet"/>
+      <w:lvlText w:val=""/>
+      <w:lvlJc w:val="left"/>
+      <w:pPr>
+        <w:tabs>
+          <w:tab w:val="num" w:pos="5040"/>
+        </w:tabs>
+        <w:ind w:left="5040" w:hanging="360"/>
+      </w:pPr>
+      <w:rPr>
+        <w:rFonts w:ascii="Wingdings" w:hAnsi="Wingdings" w:hint="default"/>
+        <w:sz w:val="20"/>
+      </w:rPr>
+    </w:lvl>
+    <w:lvl w:ilvl="7" w:tentative="1">
+      <w:start w:val="1"/>
+      <w:numFmt w:val="bullet"/>
+      <w:lvlText w:val=""/>
+      <w:lvlJc w:val="left"/>
+      <w:pPr>
+        <w:tabs>
+          <w:tab w:val="num" w:pos="5760"/>
+        </w:tabs>
+        <w:ind w:left="5760" w:hanging="360"/>
+      </w:pPr>
+      <w:rPr>
+        <w:rFonts w:ascii="Wingdings" w:hAnsi="Wingdings" w:hint="default"/>
+        <w:sz w:val="20"/>
+      </w:rPr>
+    </w:lvl>
+    <w:lvl w:ilvl="8" w:tentative="1">
+      <w:start w:val="1"/>
+      <w:numFmt w:val="bullet"/>
+      <w:lvlText w:val=""/>
+      <w:lvlJc w:val="left"/>
+      <w:pPr>
+        <w:tabs>
+          <w:tab w:val="num" w:pos="6480"/>
+        </w:tabs>
+        <w:ind w:left="6480" w:hanging="360"/>
+      </w:pPr>
+      <w:rPr>
+        <w:rFonts w:ascii="Wingdings" w:hAnsi="Wingdings" w:hint="default"/>
+        <w:sz w:val="20"/>
+      </w:rPr>
+    </w:lvl>
+  </w:abstractNum>
+  <w:abstractNum w:abstractNumId="8" w15:restartNumberingAfterBreak="0">
     <w:nsid w:val="6DCD1C0D"/>
     <w:multiLevelType w:val="multilevel"/>
     <w:tmpl w:val="922C4A54"/>
@@ -722,7 +2212,7 @@
       </w:rPr>
     </w:lvl>
   </w:abstractNum>
-  <w:abstractNum w:abstractNumId="3" w15:restartNumberingAfterBreak="0">
+  <w:abstractNum w:abstractNumId="9" w15:restartNumberingAfterBreak="0">
     <w:nsid w:val="6E964674"/>
     <w:multiLevelType w:val="multilevel"/>
     <w:tmpl w:val="06869902"/>
@@ -871,17 +2361,491 @@
       </w:rPr>
     </w:lvl>
   </w:abstractNum>
+  <w:abstractNum w:abstractNumId="10" w15:restartNumberingAfterBreak="0">
+    <w:nsid w:val="745F286D"/>
+    <w:multiLevelType w:val="multilevel"/>
+    <w:tmpl w:val="1CA678A4"/>
+    <w:lvl w:ilvl="0">
+      <w:start w:val="1"/>
+      <w:numFmt w:val="bullet"/>
+      <w:lvlText w:val=""/>
+      <w:lvlJc w:val="left"/>
+      <w:pPr>
+        <w:tabs>
+          <w:tab w:val="num" w:pos="720"/>
+        </w:tabs>
+        <w:ind w:left="720" w:hanging="360"/>
+      </w:pPr>
+      <w:rPr>
+        <w:rFonts w:ascii="Symbol" w:hAnsi="Symbol" w:hint="default"/>
+        <w:sz w:val="20"/>
+      </w:rPr>
+    </w:lvl>
+    <w:lvl w:ilvl="1" w:tentative="1">
+      <w:start w:val="1"/>
+      <w:numFmt w:val="bullet"/>
+      <w:lvlText w:val="o"/>
+      <w:lvlJc w:val="left"/>
+      <w:pPr>
+        <w:tabs>
+          <w:tab w:val="num" w:pos="1440"/>
+        </w:tabs>
+        <w:ind w:left="1440" w:hanging="360"/>
+      </w:pPr>
+      <w:rPr>
+        <w:rFonts w:ascii="Courier New" w:hAnsi="Courier New" w:hint="default"/>
+        <w:sz w:val="20"/>
+      </w:rPr>
+    </w:lvl>
+    <w:lvl w:ilvl="2" w:tentative="1">
+      <w:start w:val="1"/>
+      <w:numFmt w:val="bullet"/>
+      <w:lvlText w:val=""/>
+      <w:lvlJc w:val="left"/>
+      <w:pPr>
+        <w:tabs>
+          <w:tab w:val="num" w:pos="2160"/>
+        </w:tabs>
+        <w:ind w:left="2160" w:hanging="360"/>
+      </w:pPr>
+      <w:rPr>
+        <w:rFonts w:ascii="Wingdings" w:hAnsi="Wingdings" w:hint="default"/>
+        <w:sz w:val="20"/>
+      </w:rPr>
+    </w:lvl>
+    <w:lvl w:ilvl="3" w:tentative="1">
+      <w:start w:val="1"/>
+      <w:numFmt w:val="bullet"/>
+      <w:lvlText w:val=""/>
+      <w:lvlJc w:val="left"/>
+      <w:pPr>
+        <w:tabs>
+          <w:tab w:val="num" w:pos="2880"/>
+        </w:tabs>
+        <w:ind w:left="2880" w:hanging="360"/>
+      </w:pPr>
+      <w:rPr>
+        <w:rFonts w:ascii="Wingdings" w:hAnsi="Wingdings" w:hint="default"/>
+        <w:sz w:val="20"/>
+      </w:rPr>
+    </w:lvl>
+    <w:lvl w:ilvl="4" w:tentative="1">
+      <w:start w:val="1"/>
+      <w:numFmt w:val="bullet"/>
+      <w:lvlText w:val=""/>
+      <w:lvlJc w:val="left"/>
+      <w:pPr>
+        <w:tabs>
+          <w:tab w:val="num" w:pos="3600"/>
+        </w:tabs>
+        <w:ind w:left="3600" w:hanging="360"/>
+      </w:pPr>
+      <w:rPr>
+        <w:rFonts w:ascii="Wingdings" w:hAnsi="Wingdings" w:hint="default"/>
+        <w:sz w:val="20"/>
+      </w:rPr>
+    </w:lvl>
+    <w:lvl w:ilvl="5" w:tentative="1">
+      <w:start w:val="1"/>
+      <w:numFmt w:val="bullet"/>
+      <w:lvlText w:val=""/>
+      <w:lvlJc w:val="left"/>
+      <w:pPr>
+        <w:tabs>
+          <w:tab w:val="num" w:pos="4320"/>
+        </w:tabs>
+        <w:ind w:left="4320" w:hanging="360"/>
+      </w:pPr>
+      <w:rPr>
+        <w:rFonts w:ascii="Wingdings" w:hAnsi="Wingdings" w:hint="default"/>
+        <w:sz w:val="20"/>
+      </w:rPr>
+    </w:lvl>
+    <w:lvl w:ilvl="6" w:tentative="1">
+      <w:start w:val="1"/>
+      <w:numFmt w:val="bullet"/>
+      <w:lvlText w:val=""/>
+      <w:lvlJc w:val="left"/>
+      <w:pPr>
+        <w:tabs>
+          <w:tab w:val="num" w:pos="5040"/>
+        </w:tabs>
+        <w:ind w:left="5040" w:hanging="360"/>
+      </w:pPr>
+      <w:rPr>
+        <w:rFonts w:ascii="Wingdings" w:hAnsi="Wingdings" w:hint="default"/>
+        <w:sz w:val="20"/>
+      </w:rPr>
+    </w:lvl>
+    <w:lvl w:ilvl="7" w:tentative="1">
+      <w:start w:val="1"/>
+      <w:numFmt w:val="bullet"/>
+      <w:lvlText w:val=""/>
+      <w:lvlJc w:val="left"/>
+      <w:pPr>
+        <w:tabs>
+          <w:tab w:val="num" w:pos="5760"/>
+        </w:tabs>
+        <w:ind w:left="5760" w:hanging="360"/>
+      </w:pPr>
+      <w:rPr>
+        <w:rFonts w:ascii="Wingdings" w:hAnsi="Wingdings" w:hint="default"/>
+        <w:sz w:val="20"/>
+      </w:rPr>
+    </w:lvl>
+    <w:lvl w:ilvl="8" w:tentative="1">
+      <w:start w:val="1"/>
+      <w:numFmt w:val="bullet"/>
+      <w:lvlText w:val=""/>
+      <w:lvlJc w:val="left"/>
+      <w:pPr>
+        <w:tabs>
+          <w:tab w:val="num" w:pos="6480"/>
+        </w:tabs>
+        <w:ind w:left="6480" w:hanging="360"/>
+      </w:pPr>
+      <w:rPr>
+        <w:rFonts w:ascii="Wingdings" w:hAnsi="Wingdings" w:hint="default"/>
+        <w:sz w:val="20"/>
+      </w:rPr>
+    </w:lvl>
+  </w:abstractNum>
+  <w:abstractNum w:abstractNumId="11" w15:restartNumberingAfterBreak="0">
+    <w:nsid w:val="755C235C"/>
+    <w:multiLevelType w:val="multilevel"/>
+    <w:tmpl w:val="916C7C82"/>
+    <w:lvl w:ilvl="0">
+      <w:start w:val="1"/>
+      <w:numFmt w:val="bullet"/>
+      <w:lvlText w:val=""/>
+      <w:lvlJc w:val="left"/>
+      <w:pPr>
+        <w:tabs>
+          <w:tab w:val="num" w:pos="720"/>
+        </w:tabs>
+        <w:ind w:left="720" w:hanging="360"/>
+      </w:pPr>
+      <w:rPr>
+        <w:rFonts w:ascii="Symbol" w:hAnsi="Symbol" w:hint="default"/>
+        <w:sz w:val="20"/>
+      </w:rPr>
+    </w:lvl>
+    <w:lvl w:ilvl="1" w:tentative="1">
+      <w:start w:val="1"/>
+      <w:numFmt w:val="bullet"/>
+      <w:lvlText w:val="o"/>
+      <w:lvlJc w:val="left"/>
+      <w:pPr>
+        <w:tabs>
+          <w:tab w:val="num" w:pos="1440"/>
+        </w:tabs>
+        <w:ind w:left="1440" w:hanging="360"/>
+      </w:pPr>
+      <w:rPr>
+        <w:rFonts w:ascii="Courier New" w:hAnsi="Courier New" w:hint="default"/>
+        <w:sz w:val="20"/>
+      </w:rPr>
+    </w:lvl>
+    <w:lvl w:ilvl="2" w:tentative="1">
+      <w:start w:val="1"/>
+      <w:numFmt w:val="bullet"/>
+      <w:lvlText w:val=""/>
+      <w:lvlJc w:val="left"/>
+      <w:pPr>
+        <w:tabs>
+          <w:tab w:val="num" w:pos="2160"/>
+        </w:tabs>
+        <w:ind w:left="2160" w:hanging="360"/>
+      </w:pPr>
+      <w:rPr>
+        <w:rFonts w:ascii="Wingdings" w:hAnsi="Wingdings" w:hint="default"/>
+        <w:sz w:val="20"/>
+      </w:rPr>
+    </w:lvl>
+    <w:lvl w:ilvl="3" w:tentative="1">
+      <w:start w:val="1"/>
+      <w:numFmt w:val="bullet"/>
+      <w:lvlText w:val=""/>
+      <w:lvlJc w:val="left"/>
+      <w:pPr>
+        <w:tabs>
+          <w:tab w:val="num" w:pos="2880"/>
+        </w:tabs>
+        <w:ind w:left="2880" w:hanging="360"/>
+      </w:pPr>
+      <w:rPr>
+        <w:rFonts w:ascii="Wingdings" w:hAnsi="Wingdings" w:hint="default"/>
+        <w:sz w:val="20"/>
+      </w:rPr>
+    </w:lvl>
+    <w:lvl w:ilvl="4" w:tentative="1">
+      <w:start w:val="1"/>
+      <w:numFmt w:val="bullet"/>
+      <w:lvlText w:val=""/>
+      <w:lvlJc w:val="left"/>
+      <w:pPr>
+        <w:tabs>
+          <w:tab w:val="num" w:pos="3600"/>
+        </w:tabs>
+        <w:ind w:left="3600" w:hanging="360"/>
+      </w:pPr>
+      <w:rPr>
+        <w:rFonts w:ascii="Wingdings" w:hAnsi="Wingdings" w:hint="default"/>
+        <w:sz w:val="20"/>
+      </w:rPr>
+    </w:lvl>
+    <w:lvl w:ilvl="5" w:tentative="1">
+      <w:start w:val="1"/>
+      <w:numFmt w:val="bullet"/>
+      <w:lvlText w:val=""/>
+      <w:lvlJc w:val="left"/>
+      <w:pPr>
+        <w:tabs>
+          <w:tab w:val="num" w:pos="4320"/>
+        </w:tabs>
+        <w:ind w:left="4320" w:hanging="360"/>
+      </w:pPr>
+      <w:rPr>
+        <w:rFonts w:ascii="Wingdings" w:hAnsi="Wingdings" w:hint="default"/>
+        <w:sz w:val="20"/>
+      </w:rPr>
+    </w:lvl>
+    <w:lvl w:ilvl="6" w:tentative="1">
+      <w:start w:val="1"/>
+      <w:numFmt w:val="bullet"/>
+      <w:lvlText w:val=""/>
+      <w:lvlJc w:val="left"/>
+      <w:pPr>
+        <w:tabs>
+          <w:tab w:val="num" w:pos="5040"/>
+        </w:tabs>
+        <w:ind w:left="5040" w:hanging="360"/>
+      </w:pPr>
+      <w:rPr>
+        <w:rFonts w:ascii="Wingdings" w:hAnsi="Wingdings" w:hint="default"/>
+        <w:sz w:val="20"/>
+      </w:rPr>
+    </w:lvl>
+    <w:lvl w:ilvl="7" w:tentative="1">
+      <w:start w:val="1"/>
+      <w:numFmt w:val="bullet"/>
+      <w:lvlText w:val=""/>
+      <w:lvlJc w:val="left"/>
+      <w:pPr>
+        <w:tabs>
+          <w:tab w:val="num" w:pos="5760"/>
+        </w:tabs>
+        <w:ind w:left="5760" w:hanging="360"/>
+      </w:pPr>
+      <w:rPr>
+        <w:rFonts w:ascii="Wingdings" w:hAnsi="Wingdings" w:hint="default"/>
+        <w:sz w:val="20"/>
+      </w:rPr>
+    </w:lvl>
+    <w:lvl w:ilvl="8" w:tentative="1">
+      <w:start w:val="1"/>
+      <w:numFmt w:val="bullet"/>
+      <w:lvlText w:val=""/>
+      <w:lvlJc w:val="left"/>
+      <w:pPr>
+        <w:tabs>
+          <w:tab w:val="num" w:pos="6480"/>
+        </w:tabs>
+        <w:ind w:left="6480" w:hanging="360"/>
+      </w:pPr>
+      <w:rPr>
+        <w:rFonts w:ascii="Wingdings" w:hAnsi="Wingdings" w:hint="default"/>
+        <w:sz w:val="20"/>
+      </w:rPr>
+    </w:lvl>
+  </w:abstractNum>
+  <w:abstractNum w:abstractNumId="12" w15:restartNumberingAfterBreak="0">
+    <w:nsid w:val="7CF34D8A"/>
+    <w:multiLevelType w:val="multilevel"/>
+    <w:tmpl w:val="D0143BC6"/>
+    <w:lvl w:ilvl="0">
+      <w:start w:val="1"/>
+      <w:numFmt w:val="bullet"/>
+      <w:lvlText w:val=""/>
+      <w:lvlJc w:val="left"/>
+      <w:pPr>
+        <w:tabs>
+          <w:tab w:val="num" w:pos="720"/>
+        </w:tabs>
+        <w:ind w:left="720" w:hanging="360"/>
+      </w:pPr>
+      <w:rPr>
+        <w:rFonts w:ascii="Symbol" w:hAnsi="Symbol" w:hint="default"/>
+        <w:sz w:val="20"/>
+      </w:rPr>
+    </w:lvl>
+    <w:lvl w:ilvl="1" w:tentative="1">
+      <w:start w:val="1"/>
+      <w:numFmt w:val="bullet"/>
+      <w:lvlText w:val="o"/>
+      <w:lvlJc w:val="left"/>
+      <w:pPr>
+        <w:tabs>
+          <w:tab w:val="num" w:pos="1440"/>
+        </w:tabs>
+        <w:ind w:left="1440" w:hanging="360"/>
+      </w:pPr>
+      <w:rPr>
+        <w:rFonts w:ascii="Courier New" w:hAnsi="Courier New" w:hint="default"/>
+        <w:sz w:val="20"/>
+      </w:rPr>
+    </w:lvl>
+    <w:lvl w:ilvl="2" w:tentative="1">
+      <w:start w:val="1"/>
+      <w:numFmt w:val="bullet"/>
+      <w:lvlText w:val=""/>
+      <w:lvlJc w:val="left"/>
+      <w:pPr>
+        <w:tabs>
+          <w:tab w:val="num" w:pos="2160"/>
+        </w:tabs>
+        <w:ind w:left="2160" w:hanging="360"/>
+      </w:pPr>
+      <w:rPr>
+        <w:rFonts w:ascii="Wingdings" w:hAnsi="Wingdings" w:hint="default"/>
+        <w:sz w:val="20"/>
+      </w:rPr>
+    </w:lvl>
+    <w:lvl w:ilvl="3" w:tentative="1">
+      <w:start w:val="1"/>
+      <w:numFmt w:val="bullet"/>
+      <w:lvlText w:val=""/>
+      <w:lvlJc w:val="left"/>
+      <w:pPr>
+        <w:tabs>
+          <w:tab w:val="num" w:pos="2880"/>
+        </w:tabs>
+        <w:ind w:left="2880" w:hanging="360"/>
+      </w:pPr>
+      <w:rPr>
+        <w:rFonts w:ascii="Wingdings" w:hAnsi="Wingdings" w:hint="default"/>
+        <w:sz w:val="20"/>
+      </w:rPr>
+    </w:lvl>
+    <w:lvl w:ilvl="4" w:tentative="1">
+      <w:start w:val="1"/>
+      <w:numFmt w:val="bullet"/>
+      <w:lvlText w:val=""/>
+      <w:lvlJc w:val="left"/>
+      <w:pPr>
+        <w:tabs>
+          <w:tab w:val="num" w:pos="3600"/>
+        </w:tabs>
+        <w:ind w:left="3600" w:hanging="360"/>
+      </w:pPr>
+      <w:rPr>
+        <w:rFonts w:ascii="Wingdings" w:hAnsi="Wingdings" w:hint="default"/>
+        <w:sz w:val="20"/>
+      </w:rPr>
+    </w:lvl>
+    <w:lvl w:ilvl="5" w:tentative="1">
+      <w:start w:val="1"/>
+      <w:numFmt w:val="bullet"/>
+      <w:lvlText w:val=""/>
+      <w:lvlJc w:val="left"/>
+      <w:pPr>
+        <w:tabs>
+          <w:tab w:val="num" w:pos="4320"/>
+        </w:tabs>
+        <w:ind w:left="4320" w:hanging="360"/>
+      </w:pPr>
+      <w:rPr>
+        <w:rFonts w:ascii="Wingdings" w:hAnsi="Wingdings" w:hint="default"/>
+        <w:sz w:val="20"/>
+      </w:rPr>
+    </w:lvl>
+    <w:lvl w:ilvl="6" w:tentative="1">
+      <w:start w:val="1"/>
+      <w:numFmt w:val="bullet"/>
+      <w:lvlText w:val=""/>
+      <w:lvlJc w:val="left"/>
+      <w:pPr>
+        <w:tabs>
+          <w:tab w:val="num" w:pos="5040"/>
+        </w:tabs>
+        <w:ind w:left="5040" w:hanging="360"/>
+      </w:pPr>
+      <w:rPr>
+        <w:rFonts w:ascii="Wingdings" w:hAnsi="Wingdings" w:hint="default"/>
+        <w:sz w:val="20"/>
+      </w:rPr>
+    </w:lvl>
+    <w:lvl w:ilvl="7" w:tentative="1">
+      <w:start w:val="1"/>
+      <w:numFmt w:val="bullet"/>
+      <w:lvlText w:val=""/>
+      <w:lvlJc w:val="left"/>
+      <w:pPr>
+        <w:tabs>
+          <w:tab w:val="num" w:pos="5760"/>
+        </w:tabs>
+        <w:ind w:left="5760" w:hanging="360"/>
+      </w:pPr>
+      <w:rPr>
+        <w:rFonts w:ascii="Wingdings" w:hAnsi="Wingdings" w:hint="default"/>
+        <w:sz w:val="20"/>
+      </w:rPr>
+    </w:lvl>
+    <w:lvl w:ilvl="8" w:tentative="1">
+      <w:start w:val="1"/>
+      <w:numFmt w:val="bullet"/>
+      <w:lvlText w:val=""/>
+      <w:lvlJc w:val="left"/>
+      <w:pPr>
+        <w:tabs>
+          <w:tab w:val="num" w:pos="6480"/>
+        </w:tabs>
+        <w:ind w:left="6480" w:hanging="360"/>
+      </w:pPr>
+      <w:rPr>
+        <w:rFonts w:ascii="Wingdings" w:hAnsi="Wingdings" w:hint="default"/>
+        <w:sz w:val="20"/>
+      </w:rPr>
+    </w:lvl>
+  </w:abstractNum>
   <w:num w:numId="1" w16cid:durableId="1716544215">
+    <w:abstractNumId w:val="8"/>
+  </w:num>
+  <w:num w:numId="2" w16cid:durableId="2023894915">
+    <w:abstractNumId w:val="1"/>
+  </w:num>
+  <w:num w:numId="3" w16cid:durableId="717778285">
+    <w:abstractNumId w:val="9"/>
+  </w:num>
+  <w:num w:numId="4" w16cid:durableId="1866477561">
+    <w:abstractNumId w:val="3"/>
+  </w:num>
+  <w:num w:numId="5" w16cid:durableId="2053259684">
+    <w:abstractNumId w:val="11"/>
+  </w:num>
+  <w:num w:numId="6" w16cid:durableId="891229169">
+    <w:abstractNumId w:val="12"/>
+  </w:num>
+  <w:num w:numId="7" w16cid:durableId="1275553666">
+    <w:abstractNumId w:val="5"/>
+  </w:num>
+  <w:num w:numId="8" w16cid:durableId="1146094845">
+    <w:abstractNumId w:val="4"/>
+  </w:num>
+  <w:num w:numId="9" w16cid:durableId="39089048">
     <w:abstractNumId w:val="2"/>
   </w:num>
-  <w:num w:numId="2" w16cid:durableId="2023894915">
+  <w:num w:numId="10" w16cid:durableId="1935355916">
+    <w:abstractNumId w:val="6"/>
+  </w:num>
+  <w:num w:numId="11" w16cid:durableId="1363047905">
+    <w:abstractNumId w:val="10"/>
+  </w:num>
+  <w:num w:numId="12" w16cid:durableId="22751039">
     <w:abstractNumId w:val="0"/>
   </w:num>
-  <w:num w:numId="3" w16cid:durableId="717778285">
-    <w:abstractNumId w:val="3"/>
-  </w:num>
-  <w:num w:numId="4" w16cid:durableId="1866477561">
-    <w:abstractNumId w:val="1"/>
+  <w:num w:numId="13" w16cid:durableId="2022124775">
+    <w:abstractNumId w:val="7"/>
   </w:num>
 </w:numbering>
 </file>

</xml_diff>